<commit_message>
docs: updated report with task 1b and 1c results and charts
</commit_message>
<xml_diff>
--- a/concurrency/Lab1_Concurrency_Report.docx
+++ b/concurrency/Lab1_Concurrency_Report.docx
@@ -1,6 +1,6 @@
 
 <file path=word/document.xml><?xml version="1.0" encoding="utf-8"?>
-<w:document xmlns:wpc="http://schemas.microsoft.com/office/word/2010/wordprocessingCanvas" xmlns:mo="http://schemas.microsoft.com/office/mac/office/2008/main" xmlns:mc="http://schemas.openxmlformats.org/markup-compatibility/2006" xmlns:mv="urn:schemas-microsoft-com:mac:vml" xmlns:o="urn:schemas-microsoft-com:office:office" xmlns:r="http://schemas.openxmlformats.org/officeDocument/2006/relationships" xmlns:m="http://schemas.openxmlformats.org/officeDocument/2006/math" xmlns:v="urn:schemas-microsoft-com:vml" xmlns:wp14="http://schemas.microsoft.com/office/word/2010/wordprocessingDrawing" xmlns:wp="http://schemas.openxmlformats.org/drawingml/2006/wordprocessingDrawing" xmlns:w10="urn:schemas-microsoft-com:office:word" xmlns:w="http://schemas.openxmlformats.org/wordprocessingml/2006/main" xmlns:w14="http://schemas.microsoft.com/office/word/2010/wordml" xmlns:wpg="http://schemas.microsoft.com/office/word/2010/wordprocessingGroup" xmlns:wpi="http://schemas.microsoft.com/office/word/2010/wordprocessingInk" xmlns:wne="http://schemas.microsoft.com/office/word/2006/wordml" xmlns:wps="http://schemas.microsoft.com/office/word/2010/wordprocessingShape" mc:Ignorable="w14 wp14">
+<w:document xmlns:a="http://schemas.openxmlformats.org/drawingml/2006/main" xmlns:ns1="http://schemas.openxmlformats.org/markup-compatibility/2006" xmlns:pic="http://schemas.openxmlformats.org/drawingml/2006/picture" xmlns:r="http://schemas.openxmlformats.org/officeDocument/2006/relationships" xmlns:w="http://schemas.openxmlformats.org/wordprocessingml/2006/main" xmlns:wp="http://schemas.openxmlformats.org/drawingml/2006/wordprocessingDrawing" ns1:Ignorable="w14 wp14">
   <w:body>
     <w:p>
       <w:pPr>
@@ -278,9 +278,99 @@
       <w:r>
         <w:rPr>
           <w:rFonts w:ascii="Times New Roman" w:hAnsi="Times New Roman"/>
+          <w:b/>
           <w:sz w:val="24"/>
         </w:rPr>
-        <w:t>USB drive: (measurements pending from teammate)</w:t>
+        <w:t xml:space="preserve">Machine 2 (Teammate):</w:t>
+      </w:r>
+    </w:p>
+    <w:p>
+      <w:pPr>
+        <w:jc w:val="both"/>
+      </w:pPr>
+      <w:r>
+        <w:rPr>
+          <w:rFonts w:ascii="Times New Roman" w:hAnsi="Times New Roman"/>
+          <w:sz w:val="24"/>
+        </w:rPr>
+        <w:t xml:space="preserve">CPU: AMD Ryzen 5 7535HS with Radeon Graphics</w:t>
+      </w:r>
+    </w:p>
+    <w:p>
+      <w:pPr>
+        <w:jc w:val="both"/>
+      </w:pPr>
+      <w:r>
+        <w:rPr>
+          <w:rFonts w:ascii="Times New Roman" w:hAnsi="Times New Roman"/>
+          <w:sz w:val="24"/>
+        </w:rPr>
+        <w:t xml:space="preserve">Physical cores: 6, Logical processors: 12 (2 threads per core, SMT)</w:t>
+      </w:r>
+    </w:p>
+    <w:p>
+      <w:pPr>
+        <w:jc w:val="both"/>
+      </w:pPr>
+      <w:r>
+        <w:rPr>
+          <w:rFonts w:ascii="Times New Roman" w:hAnsi="Times New Roman"/>
+          <w:sz w:val="24"/>
+        </w:rPr>
+        <w:t xml:space="preserve">RAM: 16 GB DDR5</w:t>
+      </w:r>
+    </w:p>
+    <w:p>
+      <w:pPr>
+        <w:jc w:val="both"/>
+      </w:pPr>
+      <w:r>
+        <w:rPr>
+          <w:rFonts w:ascii="Times New Roman" w:hAnsi="Times New Roman"/>
+          <w:sz w:val="24"/>
+        </w:rPr>
+        <w:t xml:space="preserve">Disk: SK hynix HFS512GEJ4X112N NVMe SSD, 476.9 GB / Transcend TS1TMTE115S NVMe SSD, 931.5 GB</w:t>
+      </w:r>
+    </w:p>
+    <w:p>
+      <w:pPr>
+        <w:jc w:val="both"/>
+      </w:pPr>
+      <w:r>
+        <w:rPr>
+          <w:rFonts w:ascii="Times New Roman" w:hAnsi="Times New Roman"/>
+          <w:sz w:val="24"/>
+        </w:rPr>
+        <w:t xml:space="preserve">OS: CachyOS (Arch Linux), kernel 7.2.9-1-cachyos</w:t>
+      </w:r>
+    </w:p>
+    <w:p>
+      <w:pPr>
+        <w:jc w:val="both"/>
+      </w:pPr>
+      <w:r>
+        <w:rPr>
+          <w:rFonts w:ascii="Times New Roman" w:hAnsi="Times New Roman"/>
+          <w:sz w:val="24"/>
+        </w:rPr>
+        <w:t xml:space="preserve">Language: C# / .NET 10.0.112</w:t>
+      </w:r>
+    </w:p>
+    <w:p>
+      <w:pPr>
+        <w:jc w:val="both"/>
+      </w:pPr>
+    </w:p>
+    <w:p>
+      <w:pPr>
+        <w:jc w:val="both"/>
+      </w:pPr>
+      <w:r>
+        <w:rPr>
+          <w:rFonts w:ascii="Times New Roman" w:hAnsi="Times New Roman"/>
+          <w:sz w:val="24"/>
+        </w:rPr>
+        <w:t xml:space="preserve">USB drive: Flash Drive USB 3.0 / 3.2 Gen 1 (measurements pending physical test)</w:t>
       </w:r>
     </w:p>
     <w:p/>
@@ -1322,7 +1412,7 @@
       </w:pPr>
       <w:r>
         <w:drawing>
-          <wp:inline xmlns:a="http://schemas.openxmlformats.org/drawingml/2006/main" xmlns:pic="http://schemas.openxmlformats.org/drawingml/2006/picture">
+          <wp:inline>
             <wp:extent cx="5486400" cy="1529558"/>
             <wp:docPr id="1" name="Picture 1"/>
             <wp:cNvGraphicFramePr>
@@ -1483,7 +1573,7 @@
           <w:rFonts w:ascii="Times New Roman" w:hAnsi="Times New Roman"/>
           <w:sz w:val="24"/>
         </w:rPr>
-        <w:t>(Task 1b was done by teammate — results to be inserted here.)</w:t>
+        <w:t xml:space="preserve">Ranking: Version 3 (~31 ms) is fastest, Version 1 (~366 ms) is second, and Version 2 (~5836 ms) is slowest. Version 2 and Version 3 are correct (50 000 000 total). Version 1 is incorrect: it only counted ~9.5M numbers, losing over 80% of updates due to race conditions. Version 3 is fastest because each thread counts in its own local variable in CPU cache with no synchronization. Version 1 is fast because it doesn't wait for locks, but concurrent writes overwrite each other (zero was always 24 because only 24 zeros exist, so two threads rarely hit zero at the same time). Version 2 is ~188x slower than Version 3 because every single increment acquires a lock, causing extreme lock contention and cache-line bouncing across cores.</w:t>
       </w:r>
     </w:p>
     <w:p/>
@@ -1509,7 +1599,7 @@
           <w:rFonts w:ascii="Times New Roman" w:hAnsi="Times New Roman"/>
           <w:sz w:val="24"/>
         </w:rPr>
-        <w:t>(Task 1c was done by teammate — results to be inserted here.)</w:t>
+        <w:t xml:space="preserve">Task 1a is much faster than Task 1c. In Task 1a, time drops from 1114 ms on 1 thread to 234 ms on 16 threads (4.77x speed-up). In Task 1c, time starts at ~1199 ms on 1 worker and gets slower as workers are added (~1836 ms at 8 workers, ~3248 ms at 64 workers). Task 1c stops getting faster right at 1 worker. The bottleneck is the single reader thread: one thread reading 50 000 000 lines from disk sequentially cannot produce lines faster than ~1.2s. Workers cannot parse faster than the reader feeds them. Adding more workers just adds queue lock contention and context switches without any extra throughput.</w:t>
       </w:r>
     </w:p>
     <w:p/>
@@ -1535,7 +1625,7 @@
           <w:rFonts w:ascii="Times New Roman" w:hAnsi="Times New Roman"/>
           <w:sz w:val="24"/>
         </w:rPr>
-        <w:t>(Task 1c was done by teammate — results to be inserted here.)</w:t>
+        <w:t xml:space="preserve">With batches of a single line, the program would be extremely slow. Adding and removing 50 000 000 individual items from a thread-safe queue means 100 000 000 lock and signal operations. The queue overhead would dwarf the number parsing, making the run take minutes. Batches of 10 000 lines reduce queue operations to just 5 000. With a queue with no size limit, the reader would read ahead and load the entire file into memory before workers finish. Buffering 50 000 000 strings would take several gigabytes of RAM, causing garbage collector thrashing or an OutOfMemoryException. The 100-batch limit keeps memory low (~48-78 MB) by forcing the reader to wait when the queue is full.</w:t>
       </w:r>
     </w:p>
     <w:p/>
@@ -1561,8 +1651,546 @@
           <w:rFonts w:ascii="Times New Roman" w:hAnsi="Times New Roman"/>
           <w:sz w:val="24"/>
         </w:rPr>
-        <w:t>(To be completed by teammate.)</w:t>
+        <w:t xml:space="preserve">All 50 000 000 numbers are loaded from numbers.txt into an in-memory integer array before measuring. With as many threads as the processor has logical processors (12 on Ryzen 5 7535HS, 16 on Ryzen AI 7 350), the numbers are counted in three ways: shared counters without synchronization, shared counters protected by a lock, and separate counters per thread added together after all threads join. Version 1 was run three times to observe the non-deterministic behavior of race conditions.</w:t>
       </w:r>
+    </w:p>
+    <w:p>
+      <w:pPr>
+        <w:jc w:val="both"/>
+      </w:pPr>
+    </w:p>
+    <w:p>
+      <w:pPr>
+        <w:jc w:val="both"/>
+      </w:pPr>
+      <w:r>
+        <w:rPr>
+          <w:rFonts w:ascii="Times New Roman" w:hAnsi="Times New Roman"/>
+          <w:b/>
+          <w:sz w:val="24"/>
+        </w:rPr>
+        <w:t xml:space="preserve">Table 3. Task 1b results</w:t>
+      </w:r>
+    </w:p>
+    <w:tbl>
+      <w:tblPr>
+        <w:tblStyle w:val="TableGrid"/>
+        <w:tblW w:type="auto" w:w="0"/>
+        <w:jc w:val="center"/>
+        <w:tblLook w:firstColumn="1" w:firstRow="1" w:lastColumn="0" w:lastRow="0" w:noHBand="0" w:noVBand="1" w:val="04A0"/>
+      </w:tblPr>
+      <w:tblGrid>
+        <w:gridCol w:w="1500"/>
+        <w:gridCol w:w="1400"/>
+        <w:gridCol w:w="1400"/>
+        <w:gridCol w:w="1400"/>
+        <w:gridCol w:w="1400"/>
+        <w:gridCol w:w="1490"/>
+        <w:gridCol w:w="1100"/>
+      </w:tblGrid>
+      <w:tr>
+        <w:tc>
+          <w:tcPr>
+            <w:tcW w:type="dxa" w:w="1500"/>
+          </w:tcPr>
+          <w:p>
+            <w:r>
+              <w:rPr>
+                <w:rFonts w:ascii="Times New Roman" w:hAnsi="Times New Roman"/>
+                <w:b/>
+                <w:sz w:val="20"/>
+              </w:rPr>
+              <w:t>Version</w:t>
+            </w:r>
+          </w:p>
+        </w:tc>
+        <w:tc>
+          <w:tcPr>
+            <w:tcW w:type="dxa" w:w="1400"/>
+          </w:tcPr>
+          <w:p>
+            <w:r>
+              <w:rPr>
+                <w:rFonts w:ascii="Times New Roman" w:hAnsi="Times New Roman"/>
+                <w:b/>
+                <w:sz w:val="20"/>
+              </w:rPr>
+              <w:t>Time Run 1 (ms)</w:t>
+            </w:r>
+          </w:p>
+        </w:tc>
+        <w:tc>
+          <w:tcPr>
+            <w:tcW w:type="dxa" w:w="1400"/>
+          </w:tcPr>
+          <w:p>
+            <w:r>
+              <w:rPr>
+                <w:rFonts w:ascii="Times New Roman" w:hAnsi="Times New Roman"/>
+                <w:b/>
+                <w:sz w:val="20"/>
+              </w:rPr>
+              <w:t>Time Run 2 (ms)</w:t>
+            </w:r>
+          </w:p>
+        </w:tc>
+        <w:tc>
+          <w:tcPr>
+            <w:tcW w:type="dxa" w:w="1400"/>
+          </w:tcPr>
+          <w:p>
+            <w:r>
+              <w:rPr>
+                <w:rFonts w:ascii="Times New Roman" w:hAnsi="Times New Roman"/>
+                <w:b/>
+                <w:sz w:val="20"/>
+              </w:rPr>
+              <w:t>Time Run 3 (ms)</w:t>
+            </w:r>
+          </w:p>
+        </w:tc>
+        <w:tc>
+          <w:tcPr>
+            <w:tcW w:type="dxa" w:w="1400"/>
+          </w:tcPr>
+          <w:p>
+            <w:r>
+              <w:rPr>
+                <w:rFonts w:ascii="Times New Roman" w:hAnsi="Times New Roman"/>
+                <w:b/>
+                <w:sz w:val="20"/>
+              </w:rPr>
+              <w:t>Avg Time (ms)</w:t>
+            </w:r>
+          </w:p>
+        </w:tc>
+        <w:tc>
+          <w:tcPr>
+            <w:tcW w:type="dxa" w:w="1490"/>
+          </w:tcPr>
+          <w:p>
+            <w:r>
+              <w:rPr>
+                <w:rFonts w:ascii="Times New Roman" w:hAnsi="Times New Roman"/>
+                <w:b/>
+                <w:sz w:val="20"/>
+              </w:rPr>
+              <w:t>Total Counted</w:t>
+            </w:r>
+          </w:p>
+        </w:tc>
+        <w:tc>
+          <w:tcPr>
+            <w:tcW w:type="dxa" w:w="1100"/>
+          </w:tcPr>
+          <w:p>
+            <w:r>
+              <w:rPr>
+                <w:rFonts w:ascii="Times New Roman" w:hAnsi="Times New Roman"/>
+                <w:b/>
+                <w:sz w:val="20"/>
+              </w:rPr>
+              <w:t>Correct?</w:t>
+            </w:r>
+          </w:p>
+        </w:tc>
+      </w:tr>
+      <w:tr>
+        <w:tc>
+          <w:tcPr>
+            <w:tcW w:type="dxa" w:w="1500"/>
+          </w:tcPr>
+          <w:p>
+            <w:r>
+              <w:rPr>
+                <w:rFonts w:ascii="Times New Roman" w:hAnsi="Times New Roman"/>
+                <w:sz w:val="20"/>
+              </w:rPr>
+              <w:t>1 (No sync)</w:t>
+            </w:r>
+          </w:p>
+        </w:tc>
+        <w:tc>
+          <w:tcPr>
+            <w:tcW w:type="dxa" w:w="1400"/>
+          </w:tcPr>
+          <w:p>
+            <w:r>
+              <w:rPr>
+                <w:rFonts w:ascii="Times New Roman" w:hAnsi="Times New Roman"/>
+                <w:sz w:val="20"/>
+              </w:rPr>
+              <w:t>425</w:t>
+            </w:r>
+          </w:p>
+        </w:tc>
+        <w:tc>
+          <w:tcPr>
+            <w:tcW w:type="dxa" w:w="1400"/>
+          </w:tcPr>
+          <w:p>
+            <w:r>
+              <w:rPr>
+                <w:rFonts w:ascii="Times New Roman" w:hAnsi="Times New Roman"/>
+                <w:sz w:val="20"/>
+              </w:rPr>
+              <w:t>414</w:t>
+            </w:r>
+          </w:p>
+        </w:tc>
+        <w:tc>
+          <w:tcPr>
+            <w:tcW w:type="dxa" w:w="1400"/>
+          </w:tcPr>
+          <w:p>
+            <w:r>
+              <w:rPr>
+                <w:rFonts w:ascii="Times New Roman" w:hAnsi="Times New Roman"/>
+                <w:sz w:val="20"/>
+              </w:rPr>
+              <w:t>259</w:t>
+            </w:r>
+          </w:p>
+        </w:tc>
+        <w:tc>
+          <w:tcPr>
+            <w:tcW w:type="dxa" w:w="1400"/>
+          </w:tcPr>
+          <w:p>
+            <w:r>
+              <w:rPr>
+                <w:rFonts w:ascii="Times New Roman" w:hAnsi="Times New Roman"/>
+                <w:sz w:val="20"/>
+              </w:rPr>
+              <w:t>366</w:t>
+            </w:r>
+          </w:p>
+        </w:tc>
+        <w:tc>
+          <w:tcPr>
+            <w:tcW w:type="dxa" w:w="1490"/>
+          </w:tcPr>
+          <w:p>
+            <w:r>
+              <w:rPr>
+                <w:rFonts w:ascii="Times New Roman" w:hAnsi="Times New Roman"/>
+                <w:sz w:val="20"/>
+              </w:rPr>
+              <w:t>9 540 750</w:t>
+            </w:r>
+          </w:p>
+        </w:tc>
+        <w:tc>
+          <w:tcPr>
+            <w:tcW w:type="dxa" w:w="1100"/>
+          </w:tcPr>
+          <w:p>
+            <w:r>
+              <w:rPr>
+                <w:rFonts w:ascii="Times New Roman" w:hAnsi="Times New Roman"/>
+                <w:sz w:val="20"/>
+              </w:rPr>
+              <w:t>No</w:t>
+            </w:r>
+          </w:p>
+        </w:tc>
+      </w:tr>
+      <w:tr>
+        <w:tc>
+          <w:tcPr>
+            <w:tcW w:type="dxa" w:w="1500"/>
+          </w:tcPr>
+          <w:p>
+            <w:r>
+              <w:rPr>
+                <w:rFonts w:ascii="Times New Roman" w:hAnsi="Times New Roman"/>
+                <w:sz w:val="20"/>
+              </w:rPr>
+              <w:t>2 (Lock)</w:t>
+            </w:r>
+          </w:p>
+        </w:tc>
+        <w:tc>
+          <w:tcPr>
+            <w:tcW w:type="dxa" w:w="1400"/>
+          </w:tcPr>
+          <w:p>
+            <w:r>
+              <w:rPr>
+                <w:rFonts w:ascii="Times New Roman" w:hAnsi="Times New Roman"/>
+                <w:sz w:val="20"/>
+              </w:rPr>
+              <w:t>5836</w:t>
+            </w:r>
+          </w:p>
+        </w:tc>
+        <w:tc>
+          <w:tcPr>
+            <w:tcW w:type="dxa" w:w="1400"/>
+          </w:tcPr>
+          <w:p>
+            <w:r>
+              <w:rPr>
+                <w:rFonts w:ascii="Times New Roman" w:hAnsi="Times New Roman"/>
+                <w:sz w:val="20"/>
+              </w:rPr>
+              <w:t>-</w:t>
+            </w:r>
+          </w:p>
+        </w:tc>
+        <w:tc>
+          <w:tcPr>
+            <w:tcW w:type="dxa" w:w="1400"/>
+          </w:tcPr>
+          <w:p>
+            <w:r>
+              <w:rPr>
+                <w:rFonts w:ascii="Times New Roman" w:hAnsi="Times New Roman"/>
+                <w:sz w:val="20"/>
+              </w:rPr>
+              <w:t>-</w:t>
+            </w:r>
+          </w:p>
+        </w:tc>
+        <w:tc>
+          <w:tcPr>
+            <w:tcW w:type="dxa" w:w="1400"/>
+          </w:tcPr>
+          <w:p>
+            <w:r>
+              <w:rPr>
+                <w:rFonts w:ascii="Times New Roman" w:hAnsi="Times New Roman"/>
+                <w:sz w:val="20"/>
+              </w:rPr>
+              <w:t>5836</w:t>
+            </w:r>
+          </w:p>
+        </w:tc>
+        <w:tc>
+          <w:tcPr>
+            <w:tcW w:type="dxa" w:w="1490"/>
+          </w:tcPr>
+          <w:p>
+            <w:r>
+              <w:rPr>
+                <w:rFonts w:ascii="Times New Roman" w:hAnsi="Times New Roman"/>
+                <w:sz w:val="20"/>
+              </w:rPr>
+              <w:t>50 000 000</w:t>
+            </w:r>
+          </w:p>
+        </w:tc>
+        <w:tc>
+          <w:tcPr>
+            <w:tcW w:type="dxa" w:w="1100"/>
+          </w:tcPr>
+          <w:p>
+            <w:r>
+              <w:rPr>
+                <w:rFonts w:ascii="Times New Roman" w:hAnsi="Times New Roman"/>
+                <w:sz w:val="20"/>
+              </w:rPr>
+              <w:t>Yes</w:t>
+            </w:r>
+          </w:p>
+        </w:tc>
+      </w:tr>
+      <w:tr>
+        <w:tc>
+          <w:tcPr>
+            <w:tcW w:type="dxa" w:w="1500"/>
+          </w:tcPr>
+          <w:p>
+            <w:r>
+              <w:rPr>
+                <w:rFonts w:ascii="Times New Roman" w:hAnsi="Times New Roman"/>
+                <w:sz w:val="20"/>
+              </w:rPr>
+              <w:t>3 (Per-thread)</w:t>
+            </w:r>
+          </w:p>
+        </w:tc>
+        <w:tc>
+          <w:tcPr>
+            <w:tcW w:type="dxa" w:w="1400"/>
+          </w:tcPr>
+          <w:p>
+            <w:r>
+              <w:rPr>
+                <w:rFonts w:ascii="Times New Roman" w:hAnsi="Times New Roman"/>
+                <w:sz w:val="20"/>
+              </w:rPr>
+              <w:t>31</w:t>
+            </w:r>
+          </w:p>
+        </w:tc>
+        <w:tc>
+          <w:tcPr>
+            <w:tcW w:type="dxa" w:w="1400"/>
+          </w:tcPr>
+          <w:p>
+            <w:r>
+              <w:rPr>
+                <w:rFonts w:ascii="Times New Roman" w:hAnsi="Times New Roman"/>
+                <w:sz w:val="20"/>
+              </w:rPr>
+              <w:t>-</w:t>
+            </w:r>
+          </w:p>
+        </w:tc>
+        <w:tc>
+          <w:tcPr>
+            <w:tcW w:type="dxa" w:w="1400"/>
+          </w:tcPr>
+          <w:p>
+            <w:r>
+              <w:rPr>
+                <w:rFonts w:ascii="Times New Roman" w:hAnsi="Times New Roman"/>
+                <w:sz w:val="20"/>
+              </w:rPr>
+              <w:t>-</w:t>
+            </w:r>
+          </w:p>
+        </w:tc>
+        <w:tc>
+          <w:tcPr>
+            <w:tcW w:type="dxa" w:w="1400"/>
+          </w:tcPr>
+          <w:p>
+            <w:r>
+              <w:rPr>
+                <w:rFonts w:ascii="Times New Roman" w:hAnsi="Times New Roman"/>
+                <w:sz w:val="20"/>
+              </w:rPr>
+              <w:t>31</w:t>
+            </w:r>
+          </w:p>
+        </w:tc>
+        <w:tc>
+          <w:tcPr>
+            <w:tcW w:type="dxa" w:w="1490"/>
+          </w:tcPr>
+          <w:p>
+            <w:r>
+              <w:rPr>
+                <w:rFonts w:ascii="Times New Roman" w:hAnsi="Times New Roman"/>
+                <w:sz w:val="20"/>
+              </w:rPr>
+              <w:t>50 000 000</w:t>
+            </w:r>
+          </w:p>
+        </w:tc>
+        <w:tc>
+          <w:tcPr>
+            <w:tcW w:type="dxa" w:w="1100"/>
+          </w:tcPr>
+          <w:p>
+            <w:r>
+              <w:rPr>
+                <w:rFonts w:ascii="Times New Roman" w:hAnsi="Times New Roman"/>
+                <w:sz w:val="20"/>
+              </w:rPr>
+              <w:t>Yes</w:t>
+            </w:r>
+          </w:p>
+        </w:tc>
+      </w:tr>
+    </w:tbl>
+    <w:p>
+      <w:pPr>
+        <w:jc w:val="both"/>
+      </w:pPr>
+    </w:p>
+    <w:p>
+      <w:pPr>
+        <w:jc w:val="both"/>
+      </w:pPr>
+      <w:r>
+        <w:rPr>
+          <w:rFonts w:ascii="Times New Roman" w:hAnsi="Times New Roman"/>
+          <w:sz w:val="24"/>
+        </w:rPr>
+        <w:t xml:space="preserve">Correctness check: Version 2 and Version 3 produced identical counts: neg=25 005 087, pos=24 994 889, zero=24, total=50 000 000. Version 1 lost over 80% of updates due to race conditions.</w:t>
+      </w:r>
+    </w:p>
+    <w:p>
+      <w:pPr>
+        <w:jc w:val="both"/>
+      </w:pPr>
+    </w:p>
+    <w:p>
+      <w:pPr>
+        <w:jc w:val="center"/>
+      </w:pPr>
+      <w:r>
+        <w:drawing>
+          <wp:inline>
+            <wp:extent cx="5486400" cy="2162773"/>
+            <wp:docPr id="2" name="Picture 2"/>
+            <wp:cNvGraphicFramePr>
+              <a:graphicFrameLocks noChangeAspect="1"/>
+            </wp:cNvGraphicFramePr>
+            <a:graphic>
+              <a:graphicData uri="http://schemas.openxmlformats.org/drawingml/2006/picture">
+                <pic:pic>
+                  <pic:nvPicPr>
+                    <pic:cNvPr id="0" name="chart_task1b.png"/>
+                    <pic:cNvPicPr/>
+                  </pic:nvPicPr>
+                  <pic:blipFill>
+                    <a:blip r:embed="rId11"/>
+                    <a:stretch>
+                      <a:fillRect/>
+                    </a:stretch>
+                  </pic:blipFill>
+                  <pic:spPr>
+                    <a:xfrm>
+                      <a:off x="0" y="0"/>
+                      <a:ext cx="5486400" cy="2162773"/>
+                    </a:xfrm>
+                    <a:prstGeom prst="rect"/>
+                  </pic:spPr>
+                </pic:pic>
+              </a:graphicData>
+            </a:graphic>
+          </wp:inline>
+        </w:drawing>
+      </w:r>
+    </w:p>
+    <w:p>
+      <w:pPr>
+        <w:jc w:val="both"/>
+      </w:pPr>
+      <w:r>
+        <w:rPr>
+          <w:rFonts w:ascii="Times New Roman" w:hAnsi="Times New Roman"/>
+          <w:i/>
+          <w:sz w:val="20"/>
+        </w:rPr>
+        <w:t xml:space="preserve">Figure 2. Task 1b: execution time and total numbers counted across the three approaches</w:t>
+      </w:r>
+    </w:p>
+    <w:p>
+      <w:pPr>
+        <w:jc w:val="both"/>
+      </w:pPr>
+    </w:p>
+    <w:p>
+      <w:pPr>
+        <w:jc w:val="both"/>
+      </w:pPr>
+      <w:r>
+        <w:rPr>
+          <w:rFonts w:ascii="Times New Roman" w:hAnsi="Times New Roman"/>
+          <w:sz w:val="24"/>
+        </w:rPr>
+        <w:t xml:space="preserve">Note: peak memory is 236 MB because the entire dataset (50 000 000 integers) is stored in memory as an int[] array (200 MB for the array plus .NET runtime overhead). Version 3 is ~188x faster than Version 2 because threads work purely in local CPU cache with no lock contention.</w:t>
+      </w:r>
+    </w:p>
+    <w:p>
+      <w:pPr>
+        <w:jc w:val="both"/>
+      </w:pPr>
     </w:p>
     <w:p/>
     <w:p>
@@ -1587,8 +2215,1104 @@
           <w:rFonts w:ascii="Times New Roman" w:hAnsi="Times New Roman"/>
           <w:sz w:val="24"/>
         </w:rPr>
-        <w:t>(To be completed by teammate.)</w:t>
+        <w:t xml:space="preserve">One thread (the reader) reads numbers.txt line by line and puts the lines in batches of 10 000 into a thread-safe blocking queue (BlockingCollection&lt;string[]&gt;) with a capacity of 100 batches. Worker threads take batches from the queue, parse the integers and count signs into thread-local counters. When the queue has 100 batches, the reader waits; when the queue is empty, the workers wait. At EOF, the reader calls CompleteAdding(), and workers finish when the queue drains.</w:t>
       </w:r>
+    </w:p>
+    <w:p>
+      <w:pPr>
+        <w:jc w:val="both"/>
+      </w:pPr>
+    </w:p>
+    <w:p>
+      <w:pPr>
+        <w:jc w:val="both"/>
+      </w:pPr>
+      <w:r>
+        <w:rPr>
+          <w:rFonts w:ascii="Times New Roman" w:hAnsi="Times New Roman"/>
+          <w:b/>
+          <w:sz w:val="24"/>
+        </w:rPr>
+        <w:t xml:space="preserve">Table 4. Task 1c results</w:t>
+      </w:r>
+    </w:p>
+    <w:tbl>
+      <w:tblPr>
+        <w:tblStyle w:val="TableGrid"/>
+        <w:tblW w:type="auto" w:w="0"/>
+        <w:jc w:val="center"/>
+        <w:tblLook w:firstColumn="1" w:firstRow="1" w:lastColumn="0" w:lastRow="0" w:noHBand="0" w:noVBand="1" w:val="04A0"/>
+      </w:tblPr>
+      <w:tblGrid>
+        <w:gridCol w:w="1938"/>
+        <w:gridCol w:w="1938"/>
+        <w:gridCol w:w="1938"/>
+        <w:gridCol w:w="1938"/>
+        <w:gridCol w:w="1938"/>
+      </w:tblGrid>
+      <w:tr>
+        <w:tc>
+          <w:tcPr>
+            <w:tcW w:type="dxa" w:w="1938"/>
+          </w:tcPr>
+          <w:p>
+            <w:r>
+              <w:rPr>
+                <w:rFonts w:ascii="Times New Roman" w:hAnsi="Times New Roman"/>
+                <w:b/>
+                <w:sz w:val="20"/>
+              </w:rPr>
+              <w:t>Threads</w:t>
+            </w:r>
+          </w:p>
+        </w:tc>
+        <w:tc>
+          <w:tcPr>
+            <w:tcW w:type="dxa" w:w="1938"/>
+          </w:tcPr>
+          <w:p>
+            <w:r>
+              <w:rPr>
+                <w:rFonts w:ascii="Times New Roman" w:hAnsi="Times New Roman"/>
+                <w:b/>
+                <w:sz w:val="20"/>
+              </w:rPr>
+              <w:t>Time Run 1 (ms)</w:t>
+            </w:r>
+          </w:p>
+        </w:tc>
+        <w:tc>
+          <w:tcPr>
+            <w:tcW w:type="dxa" w:w="1938"/>
+          </w:tcPr>
+          <w:p>
+            <w:r>
+              <w:rPr>
+                <w:rFonts w:ascii="Times New Roman" w:hAnsi="Times New Roman"/>
+                <w:b/>
+                <w:sz w:val="20"/>
+              </w:rPr>
+              <w:t>Time Run 2 (ms)</w:t>
+            </w:r>
+          </w:p>
+        </w:tc>
+        <w:tc>
+          <w:tcPr>
+            <w:tcW w:type="dxa" w:w="1938"/>
+          </w:tcPr>
+          <w:p>
+            <w:r>
+              <w:rPr>
+                <w:rFonts w:ascii="Times New Roman" w:hAnsi="Times New Roman"/>
+                <w:b/>
+                <w:sz w:val="20"/>
+              </w:rPr>
+              <w:t>Peak RAM R1 (MB)</w:t>
+            </w:r>
+          </w:p>
+        </w:tc>
+        <w:tc>
+          <w:tcPr>
+            <w:tcW w:type="dxa" w:w="1938"/>
+          </w:tcPr>
+          <w:p>
+            <w:r>
+              <w:rPr>
+                <w:rFonts w:ascii="Times New Roman" w:hAnsi="Times New Roman"/>
+                <w:b/>
+                <w:sz w:val="20"/>
+              </w:rPr>
+              <w:t>Peak RAM R2 (MB)</w:t>
+            </w:r>
+          </w:p>
+        </w:tc>
+      </w:tr>
+      <w:tr>
+        <w:tc>
+          <w:tcPr>
+            <w:tcW w:type="dxa" w:w="1938"/>
+          </w:tcPr>
+          <w:p>
+            <w:r>
+              <w:rPr>
+                <w:rFonts w:ascii="Times New Roman" w:hAnsi="Times New Roman"/>
+                <w:sz w:val="20"/>
+              </w:rPr>
+              <w:t>1</w:t>
+            </w:r>
+          </w:p>
+        </w:tc>
+        <w:tc>
+          <w:tcPr>
+            <w:tcW w:type="dxa" w:w="1938"/>
+          </w:tcPr>
+          <w:p>
+            <w:r>
+              <w:rPr>
+                <w:rFonts w:ascii="Times New Roman" w:hAnsi="Times New Roman"/>
+                <w:sz w:val="20"/>
+              </w:rPr>
+              <w:t>1191</w:t>
+            </w:r>
+          </w:p>
+        </w:tc>
+        <w:tc>
+          <w:tcPr>
+            <w:tcW w:type="dxa" w:w="1938"/>
+          </w:tcPr>
+          <w:p>
+            <w:r>
+              <w:rPr>
+                <w:rFonts w:ascii="Times New Roman" w:hAnsi="Times New Roman"/>
+                <w:sz w:val="20"/>
+              </w:rPr>
+              <w:t>1206</w:t>
+            </w:r>
+          </w:p>
+        </w:tc>
+        <w:tc>
+          <w:tcPr>
+            <w:tcW w:type="dxa" w:w="1938"/>
+          </w:tcPr>
+          <w:p>
+            <w:r>
+              <w:rPr>
+                <w:rFonts w:ascii="Times New Roman" w:hAnsi="Times New Roman"/>
+                <w:sz w:val="20"/>
+              </w:rPr>
+              <w:t>63</w:t>
+            </w:r>
+          </w:p>
+        </w:tc>
+        <w:tc>
+          <w:tcPr>
+            <w:tcW w:type="dxa" w:w="1938"/>
+          </w:tcPr>
+          <w:p>
+            <w:r>
+              <w:rPr>
+                <w:rFonts w:ascii="Times New Roman" w:hAnsi="Times New Roman"/>
+                <w:sz w:val="20"/>
+              </w:rPr>
+              <w:t>78</w:t>
+            </w:r>
+          </w:p>
+        </w:tc>
+      </w:tr>
+      <w:tr>
+        <w:tc>
+          <w:tcPr>
+            <w:tcW w:type="dxa" w:w="1938"/>
+          </w:tcPr>
+          <w:p>
+            <w:r>
+              <w:rPr>
+                <w:rFonts w:ascii="Times New Roman" w:hAnsi="Times New Roman"/>
+                <w:sz w:val="20"/>
+              </w:rPr>
+              <w:t>2</w:t>
+            </w:r>
+          </w:p>
+        </w:tc>
+        <w:tc>
+          <w:tcPr>
+            <w:tcW w:type="dxa" w:w="1938"/>
+          </w:tcPr>
+          <w:p>
+            <w:r>
+              <w:rPr>
+                <w:rFonts w:ascii="Times New Roman" w:hAnsi="Times New Roman"/>
+                <w:sz w:val="20"/>
+              </w:rPr>
+              <w:t>1328</w:t>
+            </w:r>
+          </w:p>
+        </w:tc>
+        <w:tc>
+          <w:tcPr>
+            <w:tcW w:type="dxa" w:w="1938"/>
+          </w:tcPr>
+          <w:p>
+            <w:r>
+              <w:rPr>
+                <w:rFonts w:ascii="Times New Roman" w:hAnsi="Times New Roman"/>
+                <w:sz w:val="20"/>
+              </w:rPr>
+              <w:t>1255</w:t>
+            </w:r>
+          </w:p>
+        </w:tc>
+        <w:tc>
+          <w:tcPr>
+            <w:tcW w:type="dxa" w:w="1938"/>
+          </w:tcPr>
+          <w:p>
+            <w:r>
+              <w:rPr>
+                <w:rFonts w:ascii="Times New Roman" w:hAnsi="Times New Roman"/>
+                <w:sz w:val="20"/>
+              </w:rPr>
+              <w:t>68</w:t>
+            </w:r>
+          </w:p>
+        </w:tc>
+        <w:tc>
+          <w:tcPr>
+            <w:tcW w:type="dxa" w:w="1938"/>
+          </w:tcPr>
+          <w:p>
+            <w:r>
+              <w:rPr>
+                <w:rFonts w:ascii="Times New Roman" w:hAnsi="Times New Roman"/>
+                <w:sz w:val="20"/>
+              </w:rPr>
+              <w:t>54</w:t>
+            </w:r>
+          </w:p>
+        </w:tc>
+      </w:tr>
+      <w:tr>
+        <w:tc>
+          <w:tcPr>
+            <w:tcW w:type="dxa" w:w="1938"/>
+          </w:tcPr>
+          <w:p>
+            <w:r>
+              <w:rPr>
+                <w:rFonts w:ascii="Times New Roman" w:hAnsi="Times New Roman"/>
+                <w:sz w:val="20"/>
+              </w:rPr>
+              <w:t>4</w:t>
+            </w:r>
+          </w:p>
+        </w:tc>
+        <w:tc>
+          <w:tcPr>
+            <w:tcW w:type="dxa" w:w="1938"/>
+          </w:tcPr>
+          <w:p>
+            <w:r>
+              <w:rPr>
+                <w:rFonts w:ascii="Times New Roman" w:hAnsi="Times New Roman"/>
+                <w:sz w:val="20"/>
+              </w:rPr>
+              <w:t>1541</w:t>
+            </w:r>
+          </w:p>
+        </w:tc>
+        <w:tc>
+          <w:tcPr>
+            <w:tcW w:type="dxa" w:w="1938"/>
+          </w:tcPr>
+          <w:p>
+            <w:r>
+              <w:rPr>
+                <w:rFonts w:ascii="Times New Roman" w:hAnsi="Times New Roman"/>
+                <w:sz w:val="20"/>
+              </w:rPr>
+              <w:t>1500</w:t>
+            </w:r>
+          </w:p>
+        </w:tc>
+        <w:tc>
+          <w:tcPr>
+            <w:tcW w:type="dxa" w:w="1938"/>
+          </w:tcPr>
+          <w:p>
+            <w:r>
+              <w:rPr>
+                <w:rFonts w:ascii="Times New Roman" w:hAnsi="Times New Roman"/>
+                <w:sz w:val="20"/>
+              </w:rPr>
+              <w:t>48</w:t>
+            </w:r>
+          </w:p>
+        </w:tc>
+        <w:tc>
+          <w:tcPr>
+            <w:tcW w:type="dxa" w:w="1938"/>
+          </w:tcPr>
+          <w:p>
+            <w:r>
+              <w:rPr>
+                <w:rFonts w:ascii="Times New Roman" w:hAnsi="Times New Roman"/>
+                <w:sz w:val="20"/>
+              </w:rPr>
+              <w:t>48</w:t>
+            </w:r>
+          </w:p>
+        </w:tc>
+      </w:tr>
+      <w:tr>
+        <w:tc>
+          <w:tcPr>
+            <w:tcW w:type="dxa" w:w="1938"/>
+          </w:tcPr>
+          <w:p>
+            <w:r>
+              <w:rPr>
+                <w:rFonts w:ascii="Times New Roman" w:hAnsi="Times New Roman"/>
+                <w:sz w:val="20"/>
+              </w:rPr>
+              <w:t>8</w:t>
+            </w:r>
+          </w:p>
+        </w:tc>
+        <w:tc>
+          <w:tcPr>
+            <w:tcW w:type="dxa" w:w="1938"/>
+          </w:tcPr>
+          <w:p>
+            <w:r>
+              <w:rPr>
+                <w:rFonts w:ascii="Times New Roman" w:hAnsi="Times New Roman"/>
+                <w:sz w:val="20"/>
+              </w:rPr>
+              <w:t>1831</w:t>
+            </w:r>
+          </w:p>
+        </w:tc>
+        <w:tc>
+          <w:tcPr>
+            <w:tcW w:type="dxa" w:w="1938"/>
+          </w:tcPr>
+          <w:p>
+            <w:r>
+              <w:rPr>
+                <w:rFonts w:ascii="Times New Roman" w:hAnsi="Times New Roman"/>
+                <w:sz w:val="20"/>
+              </w:rPr>
+              <w:t>1840</w:t>
+            </w:r>
+          </w:p>
+        </w:tc>
+        <w:tc>
+          <w:tcPr>
+            <w:tcW w:type="dxa" w:w="1938"/>
+          </w:tcPr>
+          <w:p>
+            <w:r>
+              <w:rPr>
+                <w:rFonts w:ascii="Times New Roman" w:hAnsi="Times New Roman"/>
+                <w:sz w:val="20"/>
+              </w:rPr>
+              <w:t>58</w:t>
+            </w:r>
+          </w:p>
+        </w:tc>
+        <w:tc>
+          <w:tcPr>
+            <w:tcW w:type="dxa" w:w="1938"/>
+          </w:tcPr>
+          <w:p>
+            <w:r>
+              <w:rPr>
+                <w:rFonts w:ascii="Times New Roman" w:hAnsi="Times New Roman"/>
+                <w:sz w:val="20"/>
+              </w:rPr>
+              <w:t>57</w:t>
+            </w:r>
+          </w:p>
+        </w:tc>
+      </w:tr>
+      <w:tr>
+        <w:tc>
+          <w:tcPr>
+            <w:tcW w:type="dxa" w:w="1938"/>
+          </w:tcPr>
+          <w:p>
+            <w:r>
+              <w:rPr>
+                <w:rFonts w:ascii="Times New Roman" w:hAnsi="Times New Roman"/>
+                <w:sz w:val="20"/>
+              </w:rPr>
+              <w:t>16</w:t>
+            </w:r>
+          </w:p>
+        </w:tc>
+        <w:tc>
+          <w:tcPr>
+            <w:tcW w:type="dxa" w:w="1938"/>
+          </w:tcPr>
+          <w:p>
+            <w:r>
+              <w:rPr>
+                <w:rFonts w:ascii="Times New Roman" w:hAnsi="Times New Roman"/>
+                <w:sz w:val="20"/>
+              </w:rPr>
+              <w:t>2496</w:t>
+            </w:r>
+          </w:p>
+        </w:tc>
+        <w:tc>
+          <w:tcPr>
+            <w:tcW w:type="dxa" w:w="1938"/>
+          </w:tcPr>
+          <w:p>
+            <w:r>
+              <w:rPr>
+                <w:rFonts w:ascii="Times New Roman" w:hAnsi="Times New Roman"/>
+                <w:sz w:val="20"/>
+              </w:rPr>
+              <w:t>2454</w:t>
+            </w:r>
+          </w:p>
+        </w:tc>
+        <w:tc>
+          <w:tcPr>
+            <w:tcW w:type="dxa" w:w="1938"/>
+          </w:tcPr>
+          <w:p>
+            <w:r>
+              <w:rPr>
+                <w:rFonts w:ascii="Times New Roman" w:hAnsi="Times New Roman"/>
+                <w:sz w:val="20"/>
+              </w:rPr>
+              <w:t>72</w:t>
+            </w:r>
+          </w:p>
+        </w:tc>
+        <w:tc>
+          <w:tcPr>
+            <w:tcW w:type="dxa" w:w="1938"/>
+          </w:tcPr>
+          <w:p>
+            <w:r>
+              <w:rPr>
+                <w:rFonts w:ascii="Times New Roman" w:hAnsi="Times New Roman"/>
+                <w:sz w:val="20"/>
+              </w:rPr>
+              <w:t>72</w:t>
+            </w:r>
+          </w:p>
+        </w:tc>
+      </w:tr>
+      <w:tr>
+        <w:tc>
+          <w:tcPr>
+            <w:tcW w:type="dxa" w:w="1938"/>
+          </w:tcPr>
+          <w:p>
+            <w:r>
+              <w:rPr>
+                <w:rFonts w:ascii="Times New Roman" w:hAnsi="Times New Roman"/>
+                <w:sz w:val="20"/>
+              </w:rPr>
+              <w:t>32</w:t>
+            </w:r>
+          </w:p>
+        </w:tc>
+        <w:tc>
+          <w:tcPr>
+            <w:tcW w:type="dxa" w:w="1938"/>
+          </w:tcPr>
+          <w:p>
+            <w:r>
+              <w:rPr>
+                <w:rFonts w:ascii="Times New Roman" w:hAnsi="Times New Roman"/>
+                <w:sz w:val="20"/>
+              </w:rPr>
+              <w:t>2897</w:t>
+            </w:r>
+          </w:p>
+        </w:tc>
+        <w:tc>
+          <w:tcPr>
+            <w:tcW w:type="dxa" w:w="1938"/>
+          </w:tcPr>
+          <w:p>
+            <w:r>
+              <w:rPr>
+                <w:rFonts w:ascii="Times New Roman" w:hAnsi="Times New Roman"/>
+                <w:sz w:val="20"/>
+              </w:rPr>
+              <w:t>2974</w:t>
+            </w:r>
+          </w:p>
+        </w:tc>
+        <w:tc>
+          <w:tcPr>
+            <w:tcW w:type="dxa" w:w="1938"/>
+          </w:tcPr>
+          <w:p>
+            <w:r>
+              <w:rPr>
+                <w:rFonts w:ascii="Times New Roman" w:hAnsi="Times New Roman"/>
+                <w:sz w:val="20"/>
+              </w:rPr>
+              <w:t>86</w:t>
+            </w:r>
+          </w:p>
+        </w:tc>
+        <w:tc>
+          <w:tcPr>
+            <w:tcW w:type="dxa" w:w="1938"/>
+          </w:tcPr>
+          <w:p>
+            <w:r>
+              <w:rPr>
+                <w:rFonts w:ascii="Times New Roman" w:hAnsi="Times New Roman"/>
+                <w:sz w:val="20"/>
+              </w:rPr>
+              <w:t>87</w:t>
+            </w:r>
+          </w:p>
+        </w:tc>
+      </w:tr>
+      <w:tr>
+        <w:tc>
+          <w:tcPr>
+            <w:tcW w:type="dxa" w:w="1938"/>
+          </w:tcPr>
+          <w:p>
+            <w:r>
+              <w:rPr>
+                <w:rFonts w:ascii="Times New Roman" w:hAnsi="Times New Roman"/>
+                <w:sz w:val="20"/>
+              </w:rPr>
+              <w:t>64</w:t>
+            </w:r>
+          </w:p>
+        </w:tc>
+        <w:tc>
+          <w:tcPr>
+            <w:tcW w:type="dxa" w:w="1938"/>
+          </w:tcPr>
+          <w:p>
+            <w:r>
+              <w:rPr>
+                <w:rFonts w:ascii="Times New Roman" w:hAnsi="Times New Roman"/>
+                <w:sz w:val="20"/>
+              </w:rPr>
+              <w:t>3322</w:t>
+            </w:r>
+          </w:p>
+        </w:tc>
+        <w:tc>
+          <w:tcPr>
+            <w:tcW w:type="dxa" w:w="1938"/>
+          </w:tcPr>
+          <w:p>
+            <w:r>
+              <w:rPr>
+                <w:rFonts w:ascii="Times New Roman" w:hAnsi="Times New Roman"/>
+                <w:sz w:val="20"/>
+              </w:rPr>
+              <w:t>3173</w:t>
+            </w:r>
+          </w:p>
+        </w:tc>
+        <w:tc>
+          <w:tcPr>
+            <w:tcW w:type="dxa" w:w="1938"/>
+          </w:tcPr>
+          <w:p>
+            <w:r>
+              <w:rPr>
+                <w:rFonts w:ascii="Times New Roman" w:hAnsi="Times New Roman"/>
+                <w:sz w:val="20"/>
+              </w:rPr>
+              <w:t>122</w:t>
+            </w:r>
+          </w:p>
+        </w:tc>
+        <w:tc>
+          <w:tcPr>
+            <w:tcW w:type="dxa" w:w="1938"/>
+          </w:tcPr>
+          <w:p>
+            <w:r>
+              <w:rPr>
+                <w:rFonts w:ascii="Times New Roman" w:hAnsi="Times New Roman"/>
+                <w:sz w:val="20"/>
+              </w:rPr>
+              <w:t>121</w:t>
+            </w:r>
+          </w:p>
+        </w:tc>
+      </w:tr>
+    </w:tbl>
+    <w:p>
+      <w:pPr>
+        <w:jc w:val="both"/>
+      </w:pPr>
+    </w:p>
+    <w:p>
+      <w:pPr>
+        <w:jc w:val="both"/>
+      </w:pPr>
+      <w:r>
+        <w:rPr>
+          <w:rFonts w:ascii="Times New Roman" w:hAnsi="Times New Roman"/>
+          <w:sz w:val="24"/>
+        </w:rPr>
+        <w:t xml:space="preserve">Correctness check: neg=25 005 087, pos=24 994 889, zero=24, total=50 000 000. All worker configurations produced identical counts.</w:t>
+      </w:r>
+    </w:p>
+    <w:p>
+      <w:pPr>
+        <w:jc w:val="both"/>
+      </w:pPr>
+    </w:p>
+    <w:p>
+      <w:pPr>
+        <w:jc w:val="both"/>
+      </w:pPr>
+      <w:r>
+        <w:rPr>
+          <w:rFonts w:ascii="Times New Roman" w:hAnsi="Times New Roman"/>
+          <w:b/>
+          <w:sz w:val="24"/>
+        </w:rPr>
+        <w:t xml:space="preserve">Table 5. Task 1c speed-up</w:t>
+      </w:r>
+    </w:p>
+    <w:tbl>
+      <w:tblPr>
+        <w:tblStyle w:val="TableGrid"/>
+        <w:tblW w:type="auto" w:w="0"/>
+        <w:jc w:val="center"/>
+        <w:tblLook w:firstColumn="1" w:firstRow="1" w:lastColumn="0" w:lastRow="0" w:noHBand="0" w:noVBand="1" w:val="04A0"/>
+      </w:tblPr>
+      <w:tblGrid>
+        <w:gridCol w:w="3230"/>
+        <w:gridCol w:w="3230"/>
+        <w:gridCol w:w="3230"/>
+      </w:tblGrid>
+      <w:tr>
+        <w:tc>
+          <w:tcPr>
+            <w:tcW w:type="dxa" w:w="3230"/>
+          </w:tcPr>
+          <w:p>
+            <w:r>
+              <w:rPr>
+                <w:rFonts w:ascii="Times New Roman" w:hAnsi="Times New Roman"/>
+                <w:b/>
+                <w:sz w:val="20"/>
+              </w:rPr>
+              <w:t>Threads</w:t>
+            </w:r>
+          </w:p>
+        </w:tc>
+        <w:tc>
+          <w:tcPr>
+            <w:tcW w:type="dxa" w:w="3230"/>
+          </w:tcPr>
+          <w:p>
+            <w:r>
+              <w:rPr>
+                <w:rFonts w:ascii="Times New Roman" w:hAnsi="Times New Roman"/>
+                <w:b/>
+                <w:sz w:val="20"/>
+              </w:rPr>
+              <w:t>Avg Time (ms)</w:t>
+            </w:r>
+          </w:p>
+        </w:tc>
+        <w:tc>
+          <w:tcPr>
+            <w:tcW w:type="dxa" w:w="3230"/>
+          </w:tcPr>
+          <w:p>
+            <w:r>
+              <w:rPr>
+                <w:rFonts w:ascii="Times New Roman" w:hAnsi="Times New Roman"/>
+                <w:b/>
+                <w:sz w:val="20"/>
+              </w:rPr>
+              <w:t>Speed-up</w:t>
+            </w:r>
+          </w:p>
+        </w:tc>
+      </w:tr>
+      <w:tr>
+        <w:tc>
+          <w:tcPr>
+            <w:tcW w:type="dxa" w:w="3230"/>
+          </w:tcPr>
+          <w:p>
+            <w:r>
+              <w:rPr>
+                <w:rFonts w:ascii="Times New Roman" w:hAnsi="Times New Roman"/>
+                <w:sz w:val="20"/>
+              </w:rPr>
+              <w:t>1</w:t>
+            </w:r>
+          </w:p>
+        </w:tc>
+        <w:tc>
+          <w:tcPr>
+            <w:tcW w:type="dxa" w:w="3230"/>
+          </w:tcPr>
+          <w:p>
+            <w:r>
+              <w:rPr>
+                <w:rFonts w:ascii="Times New Roman" w:hAnsi="Times New Roman"/>
+                <w:sz w:val="20"/>
+              </w:rPr>
+              <w:t>1199</w:t>
+            </w:r>
+          </w:p>
+        </w:tc>
+        <w:tc>
+          <w:tcPr>
+            <w:tcW w:type="dxa" w:w="3230"/>
+          </w:tcPr>
+          <w:p>
+            <w:r>
+              <w:rPr>
+                <w:rFonts w:ascii="Times New Roman" w:hAnsi="Times New Roman"/>
+                <w:sz w:val="20"/>
+              </w:rPr>
+              <w:t>1.00x</w:t>
+            </w:r>
+          </w:p>
+        </w:tc>
+      </w:tr>
+      <w:tr>
+        <w:tc>
+          <w:tcPr>
+            <w:tcW w:type="dxa" w:w="3230"/>
+          </w:tcPr>
+          <w:p>
+            <w:r>
+              <w:rPr>
+                <w:rFonts w:ascii="Times New Roman" w:hAnsi="Times New Roman"/>
+                <w:sz w:val="20"/>
+              </w:rPr>
+              <w:t>2</w:t>
+            </w:r>
+          </w:p>
+        </w:tc>
+        <w:tc>
+          <w:tcPr>
+            <w:tcW w:type="dxa" w:w="3230"/>
+          </w:tcPr>
+          <w:p>
+            <w:r>
+              <w:rPr>
+                <w:rFonts w:ascii="Times New Roman" w:hAnsi="Times New Roman"/>
+                <w:sz w:val="20"/>
+              </w:rPr>
+              <w:t>1292</w:t>
+            </w:r>
+          </w:p>
+        </w:tc>
+        <w:tc>
+          <w:tcPr>
+            <w:tcW w:type="dxa" w:w="3230"/>
+          </w:tcPr>
+          <w:p>
+            <w:r>
+              <w:rPr>
+                <w:rFonts w:ascii="Times New Roman" w:hAnsi="Times New Roman"/>
+                <w:sz w:val="20"/>
+              </w:rPr>
+              <w:t>0.93x</w:t>
+            </w:r>
+          </w:p>
+        </w:tc>
+      </w:tr>
+      <w:tr>
+        <w:tc>
+          <w:tcPr>
+            <w:tcW w:type="dxa" w:w="3230"/>
+          </w:tcPr>
+          <w:p>
+            <w:r>
+              <w:rPr>
+                <w:rFonts w:ascii="Times New Roman" w:hAnsi="Times New Roman"/>
+                <w:sz w:val="20"/>
+              </w:rPr>
+              <w:t>4</w:t>
+            </w:r>
+          </w:p>
+        </w:tc>
+        <w:tc>
+          <w:tcPr>
+            <w:tcW w:type="dxa" w:w="3230"/>
+          </w:tcPr>
+          <w:p>
+            <w:r>
+              <w:rPr>
+                <w:rFonts w:ascii="Times New Roman" w:hAnsi="Times New Roman"/>
+                <w:sz w:val="20"/>
+              </w:rPr>
+              <w:t>1521</w:t>
+            </w:r>
+          </w:p>
+        </w:tc>
+        <w:tc>
+          <w:tcPr>
+            <w:tcW w:type="dxa" w:w="3230"/>
+          </w:tcPr>
+          <w:p>
+            <w:r>
+              <w:rPr>
+                <w:rFonts w:ascii="Times New Roman" w:hAnsi="Times New Roman"/>
+                <w:sz w:val="20"/>
+              </w:rPr>
+              <w:t>0.79x</w:t>
+            </w:r>
+          </w:p>
+        </w:tc>
+      </w:tr>
+      <w:tr>
+        <w:tc>
+          <w:tcPr>
+            <w:tcW w:type="dxa" w:w="3230"/>
+          </w:tcPr>
+          <w:p>
+            <w:r>
+              <w:rPr>
+                <w:rFonts w:ascii="Times New Roman" w:hAnsi="Times New Roman"/>
+                <w:sz w:val="20"/>
+              </w:rPr>
+              <w:t>8</w:t>
+            </w:r>
+          </w:p>
+        </w:tc>
+        <w:tc>
+          <w:tcPr>
+            <w:tcW w:type="dxa" w:w="3230"/>
+          </w:tcPr>
+          <w:p>
+            <w:r>
+              <w:rPr>
+                <w:rFonts w:ascii="Times New Roman" w:hAnsi="Times New Roman"/>
+                <w:sz w:val="20"/>
+              </w:rPr>
+              <w:t>1836</w:t>
+            </w:r>
+          </w:p>
+        </w:tc>
+        <w:tc>
+          <w:tcPr>
+            <w:tcW w:type="dxa" w:w="3230"/>
+          </w:tcPr>
+          <w:p>
+            <w:r>
+              <w:rPr>
+                <w:rFonts w:ascii="Times New Roman" w:hAnsi="Times New Roman"/>
+                <w:sz w:val="20"/>
+              </w:rPr>
+              <w:t>0.65x</w:t>
+            </w:r>
+          </w:p>
+        </w:tc>
+      </w:tr>
+      <w:tr>
+        <w:tc>
+          <w:tcPr>
+            <w:tcW w:type="dxa" w:w="3230"/>
+          </w:tcPr>
+          <w:p>
+            <w:r>
+              <w:rPr>
+                <w:rFonts w:ascii="Times New Roman" w:hAnsi="Times New Roman"/>
+                <w:sz w:val="20"/>
+              </w:rPr>
+              <w:t>16</w:t>
+            </w:r>
+          </w:p>
+        </w:tc>
+        <w:tc>
+          <w:tcPr>
+            <w:tcW w:type="dxa" w:w="3230"/>
+          </w:tcPr>
+          <w:p>
+            <w:r>
+              <w:rPr>
+                <w:rFonts w:ascii="Times New Roman" w:hAnsi="Times New Roman"/>
+                <w:sz w:val="20"/>
+              </w:rPr>
+              <w:t>2475</w:t>
+            </w:r>
+          </w:p>
+        </w:tc>
+        <w:tc>
+          <w:tcPr>
+            <w:tcW w:type="dxa" w:w="3230"/>
+          </w:tcPr>
+          <w:p>
+            <w:r>
+              <w:rPr>
+                <w:rFonts w:ascii="Times New Roman" w:hAnsi="Times New Roman"/>
+                <w:sz w:val="20"/>
+              </w:rPr>
+              <w:t>0.48x</w:t>
+            </w:r>
+          </w:p>
+        </w:tc>
+      </w:tr>
+      <w:tr>
+        <w:tc>
+          <w:tcPr>
+            <w:tcW w:type="dxa" w:w="3230"/>
+          </w:tcPr>
+          <w:p>
+            <w:r>
+              <w:rPr>
+                <w:rFonts w:ascii="Times New Roman" w:hAnsi="Times New Roman"/>
+                <w:sz w:val="20"/>
+              </w:rPr>
+              <w:t>32</w:t>
+            </w:r>
+          </w:p>
+        </w:tc>
+        <w:tc>
+          <w:tcPr>
+            <w:tcW w:type="dxa" w:w="3230"/>
+          </w:tcPr>
+          <w:p>
+            <w:r>
+              <w:rPr>
+                <w:rFonts w:ascii="Times New Roman" w:hAnsi="Times New Roman"/>
+                <w:sz w:val="20"/>
+              </w:rPr>
+              <w:t>2936</w:t>
+            </w:r>
+          </w:p>
+        </w:tc>
+        <w:tc>
+          <w:tcPr>
+            <w:tcW w:type="dxa" w:w="3230"/>
+          </w:tcPr>
+          <w:p>
+            <w:r>
+              <w:rPr>
+                <w:rFonts w:ascii="Times New Roman" w:hAnsi="Times New Roman"/>
+                <w:sz w:val="20"/>
+              </w:rPr>
+              <w:t>0.41x</w:t>
+            </w:r>
+          </w:p>
+        </w:tc>
+      </w:tr>
+      <w:tr>
+        <w:tc>
+          <w:tcPr>
+            <w:tcW w:type="dxa" w:w="3230"/>
+          </w:tcPr>
+          <w:p>
+            <w:r>
+              <w:rPr>
+                <w:rFonts w:ascii="Times New Roman" w:hAnsi="Times New Roman"/>
+                <w:sz w:val="20"/>
+              </w:rPr>
+              <w:t>64</w:t>
+            </w:r>
+          </w:p>
+        </w:tc>
+        <w:tc>
+          <w:tcPr>
+            <w:tcW w:type="dxa" w:w="3230"/>
+          </w:tcPr>
+          <w:p>
+            <w:r>
+              <w:rPr>
+                <w:rFonts w:ascii="Times New Roman" w:hAnsi="Times New Roman"/>
+                <w:sz w:val="20"/>
+              </w:rPr>
+              <w:t>3248</w:t>
+            </w:r>
+          </w:p>
+        </w:tc>
+        <w:tc>
+          <w:tcPr>
+            <w:tcW w:type="dxa" w:w="3230"/>
+          </w:tcPr>
+          <w:p>
+            <w:r>
+              <w:rPr>
+                <w:rFonts w:ascii="Times New Roman" w:hAnsi="Times New Roman"/>
+                <w:sz w:val="20"/>
+              </w:rPr>
+              <w:t>0.37x</w:t>
+            </w:r>
+          </w:p>
+        </w:tc>
+      </w:tr>
+    </w:tbl>
+    <w:p>
+      <w:pPr>
+        <w:jc w:val="both"/>
+      </w:pPr>
+    </w:p>
+    <w:p>
+      <w:pPr>
+        <w:jc w:val="center"/>
+      </w:pPr>
+      <w:r>
+        <w:drawing>
+          <wp:inline>
+            <wp:extent cx="5486400" cy="1539209"/>
+            <wp:docPr id="3" name="Picture 3"/>
+            <wp:cNvGraphicFramePr>
+              <a:graphicFrameLocks noChangeAspect="1"/>
+            </wp:cNvGraphicFramePr>
+            <a:graphic>
+              <a:graphicData uri="http://schemas.openxmlformats.org/drawingml/2006/picture">
+                <pic:pic>
+                  <pic:nvPicPr>
+                    <pic:cNvPr id="0" name="chart_task1c.png"/>
+                    <pic:cNvPicPr/>
+                  </pic:nvPicPr>
+                  <pic:blipFill>
+                    <a:blip r:embed="rId12"/>
+                    <a:stretch>
+                      <a:fillRect/>
+                    </a:stretch>
+                  </pic:blipFill>
+                  <pic:spPr>
+                    <a:xfrm>
+                      <a:off x="0" y="0"/>
+                      <a:ext cx="5486400" cy="1539209"/>
+                    </a:xfrm>
+                    <a:prstGeom prst="rect"/>
+                  </pic:spPr>
+                </pic:pic>
+              </a:graphicData>
+            </a:graphic>
+          </wp:inline>
+        </w:drawing>
+      </w:r>
+    </w:p>
+    <w:p>
+      <w:pPr>
+        <w:jc w:val="both"/>
+      </w:pPr>
+      <w:r>
+        <w:rPr>
+          <w:rFonts w:ascii="Times New Roman" w:hAnsi="Times New Roman"/>
+          <w:i/>
+          <w:sz w:val="20"/>
+        </w:rPr>
+        <w:t xml:space="preserve">Figure 3. Task 1c: time, speed-up, and memory vs. worker count</w:t>
+      </w:r>
+    </w:p>
+    <w:p>
+      <w:pPr>
+        <w:jc w:val="both"/>
+      </w:pPr>
+    </w:p>
+    <w:p>
+      <w:pPr>
+        <w:jc w:val="both"/>
+      </w:pPr>
+      <w:r>
+        <w:rPr>
+          <w:rFonts w:ascii="Times New Roman" w:hAnsi="Times New Roman"/>
+          <w:sz w:val="24"/>
+        </w:rPr>
+        <w:t xml:space="preserve">Note: peak memory stays around 48-78 MB up to 16 workers, rising slightly to 121 MB at 64 workers due to thread stacks. Memory remains low because the queue is bounded to 100 batches (at most 1 000 000 lines in memory at once).</w:t>
+      </w:r>
+    </w:p>
+    <w:p>
+      <w:pPr>
+        <w:jc w:val="both"/>
+      </w:pPr>
     </w:p>
     <w:p/>
     <w:p>
@@ -1848,7 +3572,7 @@
       </w:pPr>
       <w:r>
         <w:drawing>
-          <wp:inline xmlns:a="http://schemas.openxmlformats.org/drawingml/2006/main" xmlns:pic="http://schemas.openxmlformats.org/drawingml/2006/picture">
+          <wp:inline>
             <wp:extent cx="4572000" cy="1789981"/>
             <wp:docPr id="2" name="Picture 2"/>
             <wp:cNvGraphicFramePr>
@@ -1891,7 +3615,7 @@
           <w:b/>
           <w:sz w:val="22"/>
         </w:rPr>
-        <w:t>Figure 2. Task 2: time and speed-up on NVMe SSD</w:t>
+        <w:t>Figure 4. Task 2: time and speed-up on NVMe SSD</w:t>
       </w:r>
     </w:p>
     <w:p/>
@@ -2028,6 +3752,18 @@
         <w:t>Speed-up stops growing at 16 threads (matching the logical processor count). Beyond that, context switching and thread management overhead increase the time. Memory stays constant in Task 1a because each thread streams through its section; memory is high in Task 2 because all files are loaded into buffers.</w:t>
       </w:r>
     </w:p>
+    <w:p>
+      <w:pPr>
+        <w:jc w:val="both"/>
+      </w:pPr>
+      <w:r>
+        <w:rPr>
+          <w:rFonts w:ascii="Times New Roman" w:hAnsi="Times New Roman"/>
+          <w:sz w:val="24"/>
+        </w:rPr>
+        <w:t xml:space="preserve">In Task 1b, Version 3 shows that independent thread-local counters give near-instant execution (31 ms), while Version 1 shows that unsynchronized shared counters lose most updates, and Version 2 shows that fine-grained locking is 188x slower. In Task 1c, a single reader is an inescapable bottleneck: adding consumers cannot speed up a pipeline when the producer is already at 100%.</w:t>
+      </w:r>
+    </w:p>
     <w:p/>
     <w:p>
       <w:pPr>
@@ -2100,6 +3836,30 @@
           <w:sz w:val="24"/>
         </w:rPr>
         <w:t>Task 1a: dotnet run -c Release -- 1a &lt;threads&gt; numbers.txt</w:t>
+      </w:r>
+    </w:p>
+    <w:p>
+      <w:pPr>
+        <w:jc w:val="both"/>
+      </w:pPr>
+      <w:r>
+        <w:rPr>
+          <w:rFonts w:ascii="Times New Roman" w:hAnsi="Times New Roman"/>
+          <w:sz w:val="24"/>
+        </w:rPr>
+        <w:t xml:space="preserve">Task 1b: dotnet run -c Release -- 1b [threads] numbers.txt</w:t>
+      </w:r>
+    </w:p>
+    <w:p>
+      <w:pPr>
+        <w:jc w:val="both"/>
+      </w:pPr>
+      <w:r>
+        <w:rPr>
+          <w:rFonts w:ascii="Times New Roman" w:hAnsi="Times New Roman"/>
+          <w:sz w:val="24"/>
+        </w:rPr>
+        <w:t xml:space="preserve">Task 1c: dotnet run -c Release -- 1c &lt;threads&gt; numbers.txt</w:t>
       </w:r>
     </w:p>
     <w:p>

</xml_diff>